<commit_message>
docs: apply approved DCR-009 foundation updates to v2.1
Architecture: record unavailable parsing, manual-entry 503 responses and locally aligned Cognito flows. Implementation Plan: record F1/F2 progress and local test evidence while retaining staging gates. Technology: document optional AI configuration, parse contracts and password/SRP/refresh verification. Archive all three v2.0 originals and preserve version histories. Per-file summary and approval references: change-summaries/DCR-2026-10-01-009.md. Visual rendering unavailable: soffice.exe absent.
</commit_message>
<xml_diff>
--- a/Connecto_Architectural_Specification.docx
+++ b/Connecto_Architectural_Specification.docx
@@ -12,7 +12,7 @@
     </w:p>
     <w:p>
       <w:r>
-        <w:t>Version 2.0  |  1 October 2026</w:t>
+        <w:t>Version 2.1  |  1 October 2026</w:t>
       </w:r>
     </w:p>
     <w:p>
@@ -326,6 +326,38 @@
                 <w:sz w:val="20"/>
               </w:rPr>
               <w:t>DCR-008 consolidated DCRs 002 to 007; safety, future architecture, security, delivery gates, source traceability, local repository inventory and latest foundation status. User authorised consolidation with latest-version conflict resolution in Add project documents to docs.</w:t>
+            </w:r>
+          </w:p>
+        </w:tc>
+      </w:tr>
+      <w:tr>
+        <w:tc>
+          <w:tcPr>
+            <w:tcW w:type="dxa" w:w="1800"/>
+          </w:tcPr>
+          <w:p>
+            <w:r>
+              <w:t>2.1</w:t>
+            </w:r>
+          </w:p>
+        </w:tc>
+        <w:tc>
+          <w:tcPr>
+            <w:tcW w:type="dxa" w:w="4392"/>
+          </w:tcPr>
+          <w:p>
+            <w:r>
+              <w:t>1 Oct 2026</w:t>
+            </w:r>
+          </w:p>
+        </w:tc>
+        <w:tc>
+          <w:tcPr>
+            <w:tcW w:type="dxa" w:w="3557"/>
+          </w:tcPr>
+          <w:p>
+            <w:r>
+              <w:t>DCR-2026-10-01-009: unavailable parsing, optional AI startup and aligned local Cognito password/refresh flows; AWS and staging gates remain open. Human approval: Approve DCR-009, Plan and implement the POC MVP, chat 01a0f557-a3ee-7572-b6f9-323988c97319, turn 01a0f5ac-2514-7051-a1b7-47e967ab8992. Implementation source turn 01a0f5a0-4d6b-7453-ad35-5e4be8132072.</w:t>
             </w:r>
           </w:p>
         </w:tc>
@@ -750,7 +782,7 @@
     </w:p>
     <w:p>
       <w:r>
-        <w:t>Authenticated listing parse routes exist, but OpenAIListingParser builds a prompt and returns a fixed design-category placeholder. It makes no external model call. Real structured extraction and semantic interpretation remain unimplemented. Deterministic matching is separate; the API still requires an OpenAI key at startup. Configurable weights and representative related-wording interpretation are acceptance requirements, not delivered capabilities.</w:t>
+        <w:t>AI listing parsing is explicitly unavailable until a real adapter is implemented and validated. The current OpenAIListingParser raises a specific unavailable exception rather than returning a fixed category. Authenticated need/offering parse endpoints map that condition to HTTP 503 ProblemDetails with manual-entry guidance. API startup and structured posting no longer require an OpenAI key; setting a key does not activate extraction. Related-wording matching and configurable scoring remain unmet requirements.</w:t>
       </w:r>
     </w:p>
     <w:p>
@@ -942,7 +974,7 @@
                 <w:b w:val="0"/>
                 <w:sz w:val="20"/>
               </w:rPr>
-              <w:t>Avoid storing passwords in the application database. Align frontend USER_PASSWORD_AUTH with the Terraform client, which currently permits SRP and refresh flows.</w:t>
+              <w:t>The local Terraform public app client now permits password and refresh authentication used by the frontend, retaining SRP compatibility and generate_secret=false. This configuration change is locally contract-tested but has not been applied to AWS. Real Cognito registration, confirmation, login and refresh plus public/downstream TLS remain environment acceptance gates. The broader service/workload identity target is unchanged.</w:t>
             </w:r>
           </w:p>
         </w:tc>
@@ -1253,7 +1285,7 @@
     </w:p>
     <w:p>
       <w:r>
-        <w:t>Authenticated listing parse routes exist, but OpenAIListingParser builds a prompt and returns a fixed design-category placeholder. It makes no external model call. Real structured extraction and semantic interpretation remain unimplemented. Deterministic matching is separate; the API still requires an OpenAI key at startup. Configurable weights and representative related-wording interpretation are acceptance requirements, not delivered capabilities.</w:t>
+        <w:t>AI listing parsing is explicitly unavailable until a real adapter is implemented and validated. The current OpenAIListingParser raises a specific unavailable exception rather than returning a fixed category. Authenticated need/offering parse endpoints map that condition to HTTP 503 ProblemDetails with manual-entry guidance. API startup and structured posting no longer require an OpenAI key; setting a key does not activate extraction. Related-wording matching and configurable scoring remain unmet requirements.</w:t>
       </w:r>
     </w:p>
     <w:p>

</xml_diff>

<commit_message>
docs: publish approved DCR-010 frontend boundaries at v2.2
Architecture: application, feature, shared and service boundaries with public interfaces and injected dependencies. Implementation Plan: feature ownership and acceptance checks, retaining browser/live identity/SQL/staging gates. Technology: current frontend layout, ESLint boundary rules and automatic JSX runtime. Archive all three v2.1 originals; preserve DCR-009 decisions and histories. Per-file changes, approval and verification limitations: change-summaries/DCR-2026-10-01-010.md. Business Requirements remains v2.0; visual rendering unavailable.
</commit_message>
<xml_diff>
--- a/Connecto_Architectural_Specification.docx
+++ b/Connecto_Architectural_Specification.docx
@@ -12,7 +12,7 @@
     </w:p>
     <w:p>
       <w:r>
-        <w:t>Version 2.1  |  1 October 2026</w:t>
+        <w:t>Version 2.2  |  1 October 2026</w:t>
       </w:r>
     </w:p>
     <w:p>
@@ -358,6 +358,38 @@
           <w:p>
             <w:r>
               <w:t>DCR-2026-10-01-009: unavailable parsing, optional AI startup and aligned local Cognito password/refresh flows; AWS and staging gates remain open. Human approval: Approve DCR-009, Plan and implement the POC MVP, chat 01a0f557-a3ee-7572-b6f9-323988c97319, turn 01a0f5ac-2514-7051-a1b7-47e967ab8992. Implementation source turn 01a0f5a0-4d6b-7453-ad35-5e4be8132072.</w:t>
+            </w:r>
+          </w:p>
+        </w:tc>
+      </w:tr>
+      <w:tr>
+        <w:tc>
+          <w:tcPr>
+            <w:tcW w:type="dxa" w:w="1800"/>
+          </w:tcPr>
+          <w:p>
+            <w:r>
+              <w:t>2.2</w:t>
+            </w:r>
+          </w:p>
+        </w:tc>
+        <w:tc>
+          <w:tcPr>
+            <w:tcW w:type="dxa" w:w="4392"/>
+          </w:tcPr>
+          <w:p>
+            <w:r>
+              <w:t>1 October 2026</w:t>
+            </w:r>
+          </w:p>
+        </w:tc>
+        <w:tc>
+          <w:tcPr>
+            <w:tcW w:type="dxa" w:w="3557"/>
+          </w:tcPr>
+          <w:p>
+            <w:r>
+              <w:t>DCR-2026-10-01-010: Frontend composition, feature public interfaces and injected dependencies; session and backend authority unchanged. Human approval: Approve DCR-010, Plan and implement the POC MVP, chat 01a0f557-a3ee-7572-b6f9-323988c97319. Source: enforce the frontend implementation are componentized which is isolated, scalable and maintainable. Exact turn identifiers unavailable.</w:t>
             </w:r>
           </w:p>
         </w:tc>
@@ -724,6 +756,20 @@
     <w:p>
       <w:r>
         <w:t>Connecto.Database is a separate migration executable. Terraform manages the migration task and several supporting resources; the API service and task family are existing AWS resources referenced by the deployment workflow. A full Terraform-owned API service is not present in this baseline.</w:t>
+      </w:r>
+    </w:p>
+    <w:p>
+      <w:pPr>
+        <w:pStyle w:val="Heading1"/>
+      </w:pPr>
+      <w:r>
+        <w:t>Frontend application composition</w:t>
+      </w:r>
+    </w:p>
+    <w:p>
+      <w:pPr/>
+      <w:r>
+        <w:t>The frontend separates application composition in src/app, feature-owned UI and hooks in src/features, reusable presentation and pure utilities in src/shared, and HTTP/Cognito/session infrastructure in src/services. Each feature exposes an index.js public interface. Shared code has no application, feature or infrastructure dependencies; services do not depend on UI; features consume other features through public interfaces and receive infrastructure operations through injected clients or callbacks. AppShell handles layout and feedback, AppRouter selects screens with explicit props, and the application coordinator handles session lifecycle and cross-feature workflows. Discovery owns its filters/match loading, and activity pagination and member mapping are independent functions. These dependency boundaries support maintainability and incremental growth; they are not backend authorisation or proof of production capacity.</w:t>
       </w:r>
     </w:p>
     <w:p>
@@ -1192,7 +1238,7 @@
     </w:p>
     <w:p>
       <w:r>
-        <w:t>Source map: connecto-app/src/services and hooks; connecto-api/Connecto.Api/Authentication and Controllers; Connecto.Application/Internal; Connecto.Infrastructure/Services/Data; terraform; .github/workflows; docs/continuation.md.</w:t>
+        <w:t>Source map: connecto-app/src/app, features, shared and services; connecto-api/Connecto.Api/Authentication and Controllers; Connecto.Application/Internal; Connecto.Infrastructure/Services/Data; terraform; .github/workflows; docs/continuation.md.</w:t>
       </w:r>
     </w:p>
     <w:p>

</xml_diff>

<commit_message>
doc with s2 feature update
</commit_message>
<xml_diff>
--- a/Connecto_Architectural_Specification.docx
+++ b/Connecto_Architectural_Specification.docx
@@ -12,7 +12,7 @@
     </w:p>
     <w:p>
       <w:r>
-        <w:t>Version 2.2  |  1 October 2026</w:t>
+        <w:t>Version 2.5  |  4 October 2026</w:t>
       </w:r>
     </w:p>
     <w:p>
@@ -390,6 +390,102 @@
           <w:p>
             <w:r>
               <w:t>DCR-2026-10-01-010: Frontend composition, feature public interfaces and injected dependencies; session and backend authority unchanged. Human approval: Approve DCR-010, Plan and implement the POC MVP, chat 01a0f557-a3ee-7572-b6f9-323988c97319. Source: enforce the frontend implementation are componentized which is isolated, scalable and maintainable. Exact turn identifiers unavailable.</w:t>
+            </w:r>
+          </w:p>
+        </w:tc>
+      </w:tr>
+      <w:tr>
+        <w:tc>
+          <w:tcPr>
+            <w:tcW w:type="dxa" w:w="1800"/>
+          </w:tcPr>
+          <w:p>
+            <w:r>
+              <w:t xml:space="preserve">2.3</w:t>
+            </w:r>
+          </w:p>
+        </w:tc>
+        <w:tc>
+          <w:tcPr>
+            <w:tcW w:type="dxa" w:w="4392"/>
+          </w:tcPr>
+          <w:p>
+            <w:r>
+              <w:t xml:space="preserve">1 October 2026</w:t>
+            </w:r>
+          </w:p>
+        </w:tc>
+        <w:tc>
+          <w:tcPr>
+            <w:tcW w:type="dxa" w:w="3557"/>
+          </w:tcPr>
+          <w:p>
+            <w:r>
+              <w:t xml:space="preserve">DCR-2026-10-01-011: Cognito refresh resilience, account/session isolation, sign-in cancellation, truthful profile setup and persistent profile editing; local verification with real environment gates open. Human approval: approve DCR-011, Set up Cognito with Terraform, chat 01a0f6a3-c6e4-7f72-8f6a-8a17ccaea900, turn 01a0f6ec-02de-7c21-b48f-efef6e2661bf. Source: S0 implementation and S0–S1 continuation, including turn 01a0f6e1-d6c9-71e0-b100-14713b05955d; original Implement Cognito login and refresh chat 01a0f699-8496-76e1-8c6f-8a18e8431310, turn 01a0f69b-8b8c-7763-978b-5016e5b0d7d2. Full evidence and source references are in docs/document-change-register.md.</w:t>
+            </w:r>
+          </w:p>
+        </w:tc>
+      </w:tr>
+      <w:tr>
+        <w:tc>
+          <w:tcPr>
+            <w:tcW w:type="dxa" w:w="1800"/>
+          </w:tcPr>
+          <w:p>
+            <w:r>
+              <w:t xml:space="preserve">2.4</w:t>
+            </w:r>
+          </w:p>
+        </w:tc>
+        <w:tc>
+          <w:tcPr>
+            <w:tcW w:type="dxa" w:w="4392"/>
+          </w:tcPr>
+          <w:p>
+            <w:r>
+              <w:t xml:space="preserve">3 October 2026</w:t>
+            </w:r>
+          </w:p>
+        </w:tc>
+        <w:tc>
+          <w:tcPr>
+            <w:tcW w:type="dxa" w:w="3557"/>
+          </w:tcPr>
+          <w:p>
+            <w:r>
+              <w:t xml:space="preserve">DCR-2026-10-03-012: recorded F3 local SQL Server acceptance for S1 profile/activity. Standing implementation-document editing approval from the human in Add project documents to docs, 1 October 2026. Source: current Connecto chat, human requests 'yes, sound good, let's start' and 'continue'; evidence: docs/test-evidence/2026-10-03/f3-local-sql-acceptance.md. Real Cognito, browser and staging gates remain open.</w:t>
+            </w:r>
+          </w:p>
+        </w:tc>
+      </w:tr>
+      <w:tr>
+        <w:tc>
+          <w:tcPr>
+            <w:tcW w:type="dxa" w:w="1800"/>
+          </w:tcPr>
+          <w:p>
+            <w:r>
+              <w:t>2.5</w:t>
+            </w:r>
+          </w:p>
+        </w:tc>
+        <w:tc>
+          <w:tcPr>
+            <w:tcW w:type="dxa" w:w="4392"/>
+          </w:tcPr>
+          <w:p>
+            <w:r>
+              <w:t>4 Oct 2026</w:t>
+            </w:r>
+          </w:p>
+        </w:tc>
+        <w:tc>
+          <w:tcPr>
+            <w:tcW w:type="dxa" w:w="3557"/>
+          </w:tcPr>
+          <w:p>
+            <w:r>
+              <w:t>DCR-2026-10-03-013 approved NZD, pricing, taxonomy, legacy migration and lifecycle contract; implementation remains planned. Suggest implementation next step, chat 01a10129-b110-7792-8a7d-a86eb94c0cad; proposal turn 01a10151-ca33-75e3-88ca-394c0f0bd3c4; human approval turn 01a10153-c8c8-7502-bc16-f14816018ea1, message 01a10153-cdab-7360-91a4-d862abb4beb9: approve.</w:t>
             </w:r>
           </w:p>
         </w:tc>
@@ -796,6 +892,26 @@
     <w:p>
       <w:r>
         <w:t>1. The browser sends registration, confirmation, and login requests directly to Cognito. Access and refresh tokens stay in memory. Reloading requires a new login.</w:t>
+      </w:r>
+    </w:p>
+    <w:p>
+      <w:r>
+        <w:t xml:space="preserve">The frontend uses Cognito password and refresh flows with a public app client and memory-only tokens. Concurrent reads share one refresh. Transient refresh failures block the pending API request and allow retry; NotAuthorizedException/UserNotFoundException clears the session and requires login. Authentication results require an access token and positive finite expiry. Login/logout generations reject stale results. REFRESH_TOKEN_AUTH requires app-client refresh rotation disabled. Additional challenges and device remembering remain unsupported.</w:t>
+      </w:r>
+    </w:p>
+    <w:p>
+      <w:r>
+        <w:t xml:space="preserve">Permanent refresh rejection, missing refresh token or a 401 for the current access token invalidates the local session, notifies application composition, clears private UI state and returns to login. A 403 preserves the session. API calls capture authentication generation before token acquisition, block dispatch after account changes and discard obsolete results after response-body reads. An old account's response or an older access token's 401 cannot erase a newer session: both token and generation must still match. Transient refresh failures permit retry; writes are never automatically replayed. Logout clears local state and does not establish immediate server-side JWT revocation.</w:t>
+      </w:r>
+    </w:p>
+    <w:p>
+      <w:r>
+        <w:t xml:space="preserve">Entering welcome, login or registration invalidates the current local identity and pending authentication results. New accounts with a missing first name or neighborhood receive a dismissible profile setup prompt. Signed-in editing uses separate first/last names, preserves multiword values, matches API field lengths and sends only allowlisted firstName/lastName/city/bio. Validation rejects whitespace-only required form values. Profile-save failures retain inputs and display errors inside the dialog; save loading is independent of activity loading. Empty real profiles display neutral prompts rather than invented identity/location values. Existing middle names remain unchanged.</w:t>
+      </w:r>
+    </w:p>
+    <w:p>
+      <w:r>
+        <w:t xml:space="preserve">Configure the frontend Cognito region and public client independently from the Connecto API base URL. The API base URL must address the Connecto API or its local proxy, not Cognito; configure API issuer and audience separately. A public pool discovery response and a rejected diagnostic password request are limited connectivity/flow evidence, not successful member login or refresh. Actual app-client administrative inspection was unavailable without AWS credentials. No Terraform apply or AWS resource change was performed by the reviewed setup turns.</w:t>
       </w:r>
     </w:p>
     <w:p>
@@ -1261,7 +1377,12 @@
     </w:p>
     <w:p>
       <w:r>
-        <w:t>The initial foundation slice implements authenticated profile editing and member-scoped, paginated activity retrieval. Login loads persisted profile and activity; logout and account changes clear private session state. Session generations reject delayed API and Cognito responses from obsolete accounts. Tokens and private collections remain in memory; legacy shared private storage keys are removed. Local regression tests passed, while browser, SQL Server and AWS staging acceptance remain outstanding.</w:t>
+        <w:t xml:space="preserve">The initial foundation slice implements authenticated profile editing and member-scoped, paginated activity retrieval. Login loads persisted profile and activity; logout and account changes clear private session state. Session generations reject delayed API and Cognito responses from obsolete accounts. Tokens and private collections remain in memory; legacy shared private storage keys are removed. On 3 October 2026, a dedicated local SQL Server database passed one opt-in F3 API acceptance test covering profile persistence, ownership and activity paging across fresh API hosts. That test used signed local JWTs and an in-process API host. Real Cognito, interactive browser and AWS staging acceptance remain outstanding.</w:t>
+      </w:r>
+    </w:p>
+    <w:p>
+      <w:r>
+        <w:t xml:space="preserve">F3 local SQL acceptance passed on 3 October 2026 against a dedicated migrated LocalDB database: one test passed without skips, and cleanup left no test-prefix users. The test covers S1 profile and activity persistence and ownership, not SQL concurrency, real Cognito, browser interaction, staging HTTPS or migration recovery. S0 and S1 release acceptance remain open. Evidence: docs/test-evidence/2026-10-03/f3-local-sql-acceptance.md.</w:t>
       </w:r>
     </w:p>
     <w:p>
@@ -1319,6 +1440,11 @@
     <w:p>
       <w:r>
         <w:t>The current API adds PATCH /api/users/me and GET /api/users/me/activity using the existing database schema. Activity queries derive member identity from authentication and return bounded pages of only that member's records. Frontend private collections now use session memory rather than shared browser storage; login rehydrates profile/activity from server reads. Session generations prevent previous-account responses and delayed Cognito login/refresh operations from restoring obsolete state. These controls have local regression coverage, with live transport and database behaviour still unverified.</w:t>
+      </w:r>
+    </w:p>
+    <w:p>
+      <w:r>
+        <w:t xml:space="preserve">The S0–S1 continuation passed 44 frontend tests, 28 backend tests, lint, production build and one identity-flow contract check on 1 October 2026. New checks cover profile retrieval through a fresh HTTP client, per-member edit isolation, unchanged persisted values after rejected length validation, allowlisted form payloads and empty-profile/error presentation. Transport tests are mocked. EF InMemory, signed test JWTs and server-rendered components do not establish real Cognito, SQL Server or browser acceptance. Those gates and staging HTTPS/migration recovery remain outstanding. S0 and S1 staging acceptance are not closed.</w:t>
       </w:r>
     </w:p>
     <w:p>
@@ -5053,17 +5179,70 @@
     </w:p>
     <w:p>
       <w:r>
+        <w:t xml:space="preserve">DCR-2026-10-01-011 applied on 1 October 2026. Human approval: approve DCR-011, Set up Cognito with Terraform, chat 01a0f6a3-c6e4-7f72-8f6a-8a17ccaea900, turn 01a0f6ec-02de-7c21-b48f-efef6e2661bf. Source: S0 implementation and S0–S1 continuation, including turn 01a0f6e1-d6c9-71e0-b100-14713b05955d; original Implement Cognito login and refresh chat 01a0f699-8496-76e1-8c6f-8a18e8431310, turn 01a0f69b-8b8c-7763-978b-5016e5b0d7d2. Full evidence and source references are in docs/document-change-register.md. Verification records: docs/test-evidence/2026-10-01/s0-account-isolation.md and s0-s1-signin-profile.md. Earlier 32/40 frontend-test results are historical checkpoints superseded by the 44-test continuation. The initial backend test run was blocked by Windows logging permissions; the approved outside-sandbox rerun passed. No live AWS apply, database migration or deployment is asserted. GitHub publication requires separate explicit approval.</w:t>
+      </w:r>
+    </w:p>
+    <w:p>
+      <w:r>
         <w:t>DCR-2026-10-01-008 consolidates source proposals 002, 003, 004, 005, 006 and 007. Source chats: Identify external service risks; Design domain microservices and app; Define Connecto domain boundaries; Plan and implement the POC MVP; Define Business Requirements; Security Assessments. Exact chat and turn references are retained in docs/document-change-register.md.</w:t>
       </w:r>
     </w:p>
     <w:p>
       <w:r>
-        <w:t>Latest code evidence: UserController.cs, useConnecto.js, sessionScope.js, cognito.js and api.js. Reported local verification: 21 backend tests and 22 frontend tests, lint and production build passed. EF InMemory checks do not establish real SQL Server concurrency, browser or AWS behaviour. Target services, safety operations, messaging, reviews, photos and extraction remain future implementation.</w:t>
+        <w:t xml:space="preserve">DCR-008 historical code evidence: UserController.cs, useConnecto.js, sessionScope.js, cognito.js and api.js. Earlier reported local verification: 21 backend tests and 22 frontend tests, lint and production build passed. EF InMemory checks do not establish real SQL Server concurrency, browser or AWS behaviour. Target services, safety operations, messaging, reviews, photos and extraction remain future implementation.</w:t>
       </w:r>
     </w:p>
     <w:p>
       <w:r>
         <w:t>Conflict resolution: latest foundation status supersedes older profile/cache gaps; latest MVP plan governs initial delivery inside the existing host; microservices design version 0.2 governs later extraction and acceptance finalisation. Historical source scope and old version history remain identifiable. Undecided operating policies are release dependencies, not silently assigned values.</w:t>
+      </w:r>
+    </w:p>
+    <w:p>
+      <w:pPr>
+        <w:pStyle w:val="Heading1"/>
+      </w:pPr>
+      <w:r>
+        <w:t>Approved S2 listing contract</w:t>
+      </w:r>
+    </w:p>
+    <w:p>
+      <w:r>
+        <w:t>POC production listings use NZD as the only accepted currency. Each new Need or Offering has pricingBasis fixed, hourly, free or negotiable. Amounts are decimal NZD and optional only for free or negotiable. Fixed represents the complete listing total; hourly represents the per-hour rate.</w:t>
+      </w:r>
+    </w:p>
+    <w:p>
+      <w:r>
+        <w:t>Numeric matching runs only when the Need and Offering have compatible currency and pricing basis. Hourly comparison requires a stated estimated-hours value.</w:t>
+      </w:r>
+    </w:p>
+    <w:p>
+      <w:r>
+        <w:t>Managed taxonomy version 1 accepts Home and Garden, Household Support, Technology, Learning and Creative. Skills remain a separate bounded allowlist.</w:t>
+      </w:r>
+    </w:p>
+    <w:p>
+      <w:r>
+        <w:t>An additive migration retains existing listings with pricingBasis legacyUnknown and null currency. They remain available in own activity but are excluded from new discovery and ranking until the owner explicitly edits and republishes them.</w:t>
+      </w:r>
+    </w:p>
+    <w:p>
+      <w:r>
+        <w:t>Listing statuses migrate explicitly to draft, published, paused and closed. Changes are owner-only and use an integer revision for stale-write conflicts. Published listings may be paused or closed. Closed listings cannot be reopened through the POC API.</w:t>
+      </w:r>
+    </w:p>
+    <w:p>
+      <w:r>
+        <w:t>DCR-013 is an approved contract, not evidence of delivered S2 behaviour. It resolves the previously undecided POC currency, pricing basis, taxonomy and listing lifecycle choices only. All other unresolved operating policies and release gates remain unchanged. Implementation and acceptance checks described here are outstanding.</w:t>
+      </w:r>
+    </w:p>
+    <w:p>
+      <w:r>
+        <w:t>Implement an additive EF migration, backend validation and ownership/conflict tests returning 409 for stale revisions, frontend creation and editing with truthful price labels and empty/error/retry states, and real SQL checks for decimal precision, owner isolation and stale revisions. Discovery must exclude paused, closed and legacy-unknown listings. These are planned acceptance checks; no result is claimed.</w:t>
+      </w:r>
+    </w:p>
+    <w:p>
+      <w:r>
+        <w:t>Approval and source: Suggest implementation next step, chat 01a10129-b110-7792-8a7d-a86eb94c0cad; proposal turn 01a10151-ca33-75e3-88ca-394c0f0bd3c4; human approval turn 01a10153-c8c8-7502-bc16-f14816018ea1, message 01a10153-cdab-7360-91a4-d862abb4beb9: approve.</w:t>
       </w:r>
     </w:p>
     <w:sectPr>

</xml_diff>

<commit_message>
update s5 feature docs
</commit_message>
<xml_diff>
--- a/Connecto_Architectural_Specification.docx
+++ b/Connecto_Architectural_Specification.docx
@@ -12,7 +12,7 @@
     </w:p>
     <w:p>
       <w:r>
-        <w:t>Version 2.7  |  5 October 2026</w:t>
+        <w:t>Version 2.8  |  6 October 2026</w:t>
       </w:r>
     </w:p>
     <w:p>
@@ -550,6 +550,38 @@
           <w:p>
             <w:r>
               <w:t>DCR-015 local S4 safety and outbox implementation status; release and policy gates remain open. Standing implementation-document editing approval, Add project documents to docs, 1 October 2026. Human request in this chat, 5 October 2026: complete s4 frontend and backend implementation.</w:t>
+            </w:r>
+          </w:p>
+        </w:tc>
+      </w:tr>
+      <w:tr>
+        <w:tc>
+          <w:tcPr>
+            <w:tcW w:type="dxa" w:w="1800"/>
+          </w:tcPr>
+          <w:p>
+            <w:r>
+              <w:t>2.8</w:t>
+            </w:r>
+          </w:p>
+        </w:tc>
+        <w:tc>
+          <w:tcPr>
+            <w:tcW w:type="dxa" w:w="4392"/>
+          </w:tcPr>
+          <w:p>
+            <w:r>
+              <w:t>6 October 2026</w:t>
+            </w:r>
+          </w:p>
+        </w:tc>
+        <w:tc>
+          <w:tcPr>
+            <w:tcW w:type="dxa" w:w="3557"/>
+          </w:tcPr>
+          <w:p>
+            <w:r>
+              <w:t>DCR-2026-10-06-016: S5 local request flow and open acceptance gates. Standing human implementation-document editing approval, Add project documents to docs, 1 October 2026. Source: Complete S5 frontend and backend implementation, 6 October 2026.</w:t>
             </w:r>
           </w:p>
         </w:tc>
@@ -5345,6 +5377,20 @@
         <w:t>This is local implementation evidence, not an accepted S4 release. SQL migration/transaction and competing-dispatcher checks, kill/restart replay, real Cognito group, multi-account browser and staging checks remain open. Named reviewer, support coverage, escalation/appeal and retention rules remain unresolved for a real-member pilot.</w:t>
       </w:r>
     </w:p>
+    <w:p>
+      <w:pPr>
+        <w:pStyle w:val="Heading1"/>
+      </w:pPr>
+      <w:r>
+        <w:t>S5 local implementation status</w:t>
+      </w:r>
+    </w:p>
+    <w:p>
+      <w:pPr/>
+      <w:r>
+        <w:t>S5 is locally implemented in the existing ASP.NET Core host. A connection request joins a published Need owned by the sender to a published Offering owned by another member. The server derives both participants and stores explicit proposed terms, price basis/amount and listing revisions. Participant-only reads and inbox results exclude outsiders. Pending duplicate pairs are rejected; a filtered unique SQL index is generated for concurrent protection. The recipient may decline and the sender may withdraw with request revision checks. Terminal history remains readable. React provides the proposal form and server-backed inbox. This is local implementation, not an accepted release: the migration has not run on SQL Server, and SQL concurrency/restart, real Cognito multi-account browser, accessibility and staging checks remain open. S6 acceptance and agreements are not implemented.</w:t>
+      </w:r>
+    </w:p>
     <w:sectPr>
       <w:footerReference w:type="default" r:id="rId9"/>
       <w:pgSz w:w="11909" w:h="16834"/>

</xml_diff>